<commit_message>
Update staff Getting Started guide and AI Use Policy tools table
Guide: add contents TOC + section anchors, swap Step 5 example to a
support-chat scenario, shorten contact name. Policy: revise 3.2 tools
table (AI Advisor, updated STA Support Chat, STA Salesforce Cohort),
remove Skyward Update Monitor and The Architect rows, reword 3.2 intro.
Regenerate policy HTML and sync guide HTML + DOCX to dist.

Co-Authored-By: Claude Opus 4.7 (1M context) <noreply@anthropic.com>
</commit_message>
<xml_diff>
--- a/dist/files/ai-acceptable-use-policy.docx
+++ b/dist/files/ai-acceptable-use-policy.docx
@@ -1553,7 +1553,7 @@
           <w:sz w:val="22"/>
           <w:szCs w:val="22"/>
         </w:rPr>
-        <w:t xml:space="preserve">The following tools have been built specifically for School Technology workflows and are available within Cowork. These are the recommended starting point for common tasks:</w:t>
+        <w:t>The following tools have been built specifically for School Technology workflows and are available as Claude.ai Projects within claude.ai. These are the recommended starting point for common tasks:</w:t>
       </w:r>
     </w:p>
     <w:p>
@@ -1716,7 +1716,7 @@
                 <w:sz w:val="21"/>
                 <w:szCs w:val="21"/>
               </w:rPr>
-              <w:t xml:space="preserve">Document Maker</w:t>
+              <w:t>AI Advisor</w:t>
             </w:r>
           </w:p>
         </w:tc>
@@ -1747,7 +1747,7 @@
                 <w:sz w:val="21"/>
                 <w:szCs w:val="21"/>
               </w:rPr>
-              <w:t xml:space="preserve">Creates School Technology-branded documents: Word, PDF, PowerPoint, Excel, and Help Center articles</w:t>
+              <w:t>Your starting point for the AI program. Explore where AI could help your work, find out what tools are built or coming, get plain-language answers about the AI program, or frame an idea to bring to Adam.</w:t>
             </w:r>
           </w:p>
         </w:tc>
@@ -1778,7 +1778,7 @@
                 <w:sz w:val="21"/>
                 <w:szCs w:val="21"/>
               </w:rPr>
-              <w:t xml:space="preserve">All staff</w:t>
+              <w:t>All staff</w:t>
             </w:r>
           </w:p>
         </w:tc>
@@ -1844,7 +1844,7 @@
                 <w:sz w:val="21"/>
                 <w:szCs w:val="21"/>
               </w:rPr>
-              <w:t xml:space="preserve">Troubleshooting guidance for School Technology products</w:t>
+              <w:t>Troubleshooting guidance and step-by-step walkthroughs for School Technology products, plus customer email drafts grounded in the STA Help Center. Flags what it does not know rather than guessing.</w:t>
             </w:r>
           </w:p>
         </w:tc>
@@ -1909,7 +1909,7 @@
                 <w:sz w:val="21"/>
                 <w:szCs w:val="21"/>
               </w:rPr>
-              <w:t xml:space="preserve">SF Admin Assistant</w:t>
+              <w:t>STA Salesforce Cohort</w:t>
             </w:r>
           </w:p>
         </w:tc>
@@ -1940,7 +1940,7 @@
                 <w:sz w:val="21"/>
                 <w:szCs w:val="21"/>
               </w:rPr>
-              <w:t xml:space="preserve">Salesforce admin guidance, report building, SOQL help</w:t>
+              <w:t>Salesforce admin guidance, step-by-step admin tasks, formula drafts, and multi-approach tradeoffs.</w:t>
             </w:r>
           </w:p>
         </w:tc>
@@ -1971,200 +1971,7 @@
                 <w:sz w:val="21"/>
                 <w:szCs w:val="21"/>
               </w:rPr>
-              <w:t xml:space="preserve">SF admins / IT</w:t>
-            </w:r>
-          </w:p>
-        </w:tc>
-      </w:tr>
-      <w:tr>
-        <w:tc>
-          <w:tcPr>
-            <w:tcW w:type="dxa" w:w="2200"/>
-            <w:tcBorders>
-              <w:top w:val="single" w:color="CCCCCC" w:sz="1"/>
-              <w:left w:val="single" w:color="CCCCCC" w:sz="1"/>
-              <w:bottom w:val="single" w:color="CCCCCC" w:sz="1"/>
-              <w:right w:val="single" w:color="CCCCCC" w:sz="1"/>
-            </w:tcBorders>
-            <w:shd w:fill="F0F6FC" w:val="clear"/>
-            <w:tcMar>
-              <w:top w:type="dxa" w:w="80"/>
-              <w:left w:type="dxa" w:w="120"/>
-              <w:bottom w:type="dxa" w:w="80"/>
-              <w:right w:type="dxa" w:w="120"/>
-            </w:tcMar>
-          </w:tcPr>
-          <w:p>
-            <w:pPr>
-              <w:spacing w:after="0" w:before="0"/>
-            </w:pPr>
-            <w:r>
-              <w:rPr>
-                <w:rFonts w:ascii="Arial" w:cs="Arial" w:eastAsia="Arial" w:hAnsi="Arial"/>
-                <w:color w:val="1F2D3D"/>
-                <w:sz w:val="21"/>
-                <w:szCs w:val="21"/>
-              </w:rPr>
-              <w:t xml:space="preserve">Skyward Update Monitor</w:t>
-            </w:r>
-          </w:p>
-        </w:tc>
-        <w:tc>
-          <w:tcPr>
-            <w:tcW w:type="dxa" w:w="4560"/>
-            <w:tcBorders>
-              <w:top w:val="single" w:color="CCCCCC" w:sz="1"/>
-              <w:left w:val="single" w:color="CCCCCC" w:sz="1"/>
-              <w:bottom w:val="single" w:color="CCCCCC" w:sz="1"/>
-              <w:right w:val="single" w:color="CCCCCC" w:sz="1"/>
-            </w:tcBorders>
-            <w:shd w:fill="F0F6FC" w:val="clear"/>
-            <w:tcMar>
-              <w:top w:type="dxa" w:w="80"/>
-              <w:left w:type="dxa" w:w="120"/>
-              <w:bottom w:type="dxa" w:w="80"/>
-              <w:right w:type="dxa" w:w="120"/>
-            </w:tcMar>
-          </w:tcPr>
-          <w:p>
-            <w:pPr>
-              <w:spacing w:after="0" w:before="0"/>
-            </w:pPr>
-            <w:r>
-              <w:rPr>
-                <w:rFonts w:ascii="Arial" w:cs="Arial" w:eastAsia="Arial" w:hAnsi="Arial"/>
-                <w:color w:val="1F2D3D"/>
-                <w:sz w:val="21"/>
-                <w:szCs w:val="21"/>
-              </w:rPr>
-              <w:t xml:space="preserve">Monitors web and email sources for Skyward product updates relevant to existing lines and new feature opportunities</w:t>
-            </w:r>
-          </w:p>
-        </w:tc>
-        <w:tc>
-          <w:tcPr>
-            <w:tcW w:type="dxa" w:w="2600"/>
-            <w:tcBorders>
-              <w:top w:val="single" w:color="CCCCCC" w:sz="1"/>
-              <w:left w:val="single" w:color="CCCCCC" w:sz="1"/>
-              <w:bottom w:val="single" w:color="CCCCCC" w:sz="1"/>
-              <w:right w:val="single" w:color="CCCCCC" w:sz="1"/>
-            </w:tcBorders>
-            <w:shd w:fill="F0F6FC" w:val="clear"/>
-            <w:tcMar>
-              <w:top w:type="dxa" w:w="80"/>
-              <w:left w:type="dxa" w:w="120"/>
-              <w:bottom w:type="dxa" w:w="80"/>
-              <w:right w:type="dxa" w:w="120"/>
-            </w:tcMar>
-          </w:tcPr>
-          <w:p>
-            <w:pPr>
-              <w:spacing w:after="0" w:before="0"/>
-            </w:pPr>
-            <w:r>
-              <w:rPr>
-                <w:rFonts w:ascii="Arial" w:cs="Arial" w:eastAsia="Arial" w:hAnsi="Arial"/>
-                <w:color w:val="1F2D3D"/>
-                <w:sz w:val="21"/>
-                <w:szCs w:val="21"/>
-              </w:rPr>
-              <w:t xml:space="preserve">IT / Product</w:t>
-            </w:r>
-          </w:p>
-        </w:tc>
-      </w:tr>
-      <w:tr>
-        <w:tc>
-          <w:tcPr>
-            <w:tcW w:type="dxa" w:w="2200"/>
-            <w:tcBorders>
-              <w:top w:val="single" w:color="CCCCCC" w:sz="1"/>
-              <w:left w:val="single" w:color="CCCCCC" w:sz="1"/>
-              <w:bottom w:val="single" w:color="CCCCCC" w:sz="1"/>
-              <w:right w:val="single" w:color="CCCCCC" w:sz="1"/>
-            </w:tcBorders>
-            <w:tcMar>
-              <w:top w:type="dxa" w:w="80"/>
-              <w:left w:type="dxa" w:w="120"/>
-              <w:bottom w:type="dxa" w:w="80"/>
-              <w:right w:type="dxa" w:w="120"/>
-            </w:tcMar>
-          </w:tcPr>
-          <w:p>
-            <w:pPr>
-              <w:spacing w:after="0" w:before="0"/>
-            </w:pPr>
-            <w:r>
-              <w:rPr>
-                <w:rFonts w:ascii="Arial" w:cs="Arial" w:eastAsia="Arial" w:hAnsi="Arial"/>
-                <w:color w:val="1F2D3D"/>
-                <w:sz w:val="21"/>
-                <w:szCs w:val="21"/>
-              </w:rPr>
-              <w:t xml:space="preserve">The Architect</w:t>
-            </w:r>
-          </w:p>
-        </w:tc>
-        <w:tc>
-          <w:tcPr>
-            <w:tcW w:type="dxa" w:w="4560"/>
-            <w:tcBorders>
-              <w:top w:val="single" w:color="CCCCCC" w:sz="1"/>
-              <w:left w:val="single" w:color="CCCCCC" w:sz="1"/>
-              <w:bottom w:val="single" w:color="CCCCCC" w:sz="1"/>
-              <w:right w:val="single" w:color="CCCCCC" w:sz="1"/>
-            </w:tcBorders>
-            <w:tcMar>
-              <w:top w:type="dxa" w:w="80"/>
-              <w:left w:type="dxa" w:w="120"/>
-              <w:bottom w:type="dxa" w:w="80"/>
-              <w:right w:type="dxa" w:w="120"/>
-            </w:tcMar>
-          </w:tcPr>
-          <w:p>
-            <w:pPr>
-              <w:spacing w:after="0" w:before="0"/>
-            </w:pPr>
-            <w:r>
-              <w:rPr>
-                <w:rFonts w:ascii="Arial" w:cs="Arial" w:eastAsia="Arial" w:hAnsi="Arial"/>
-                <w:color w:val="1F2D3D"/>
-                <w:sz w:val="21"/>
-                <w:szCs w:val="21"/>
-              </w:rPr>
-              <w:t xml:space="preserve">Designing, building, and maintaining AI tools - production-ready instructions, test cases, registry, and pipeline handoff in one session. Absorbed Botmaker and Skillmaker capabilities (2026-04-27).</w:t>
-            </w:r>
-          </w:p>
-        </w:tc>
-        <w:tc>
-          <w:tcPr>
-            <w:tcW w:type="dxa" w:w="2600"/>
-            <w:tcBorders>
-              <w:top w:val="single" w:color="CCCCCC" w:sz="1"/>
-              <w:left w:val="single" w:color="CCCCCC" w:sz="1"/>
-              <w:bottom w:val="single" w:color="CCCCCC" w:sz="1"/>
-              <w:right w:val="single" w:color="CCCCCC" w:sz="1"/>
-            </w:tcBorders>
-            <w:tcMar>
-              <w:top w:type="dxa" w:w="80"/>
-              <w:left w:type="dxa" w:w="120"/>
-              <w:bottom w:type="dxa" w:w="80"/>
-              <w:right w:type="dxa" w:w="120"/>
-            </w:tcMar>
-          </w:tcPr>
-          <w:p>
-            <w:pPr>
-              <w:spacing w:after="0" w:before="0"/>
-            </w:pPr>
-            <w:r>
-              <w:rPr>
-                <w:rFonts w:ascii="Arial" w:cs="Arial" w:eastAsia="Arial" w:hAnsi="Arial"/>
-                <w:color w:val="1F2D3D"/>
-                <w:sz w:val="21"/>
-                <w:szCs w:val="21"/>
-              </w:rPr>
-              <w:t xml:space="preserve">IT / power users only</w:t>
+              <w:t>SF admins</w:t>
             </w:r>
           </w:p>
         </w:tc>

</xml_diff>

<commit_message>
Start tab per-section progress bars; AI Admin all tool briefs; HTML checklist in all panels; remove AUP signature block; Getting Started screenshots; add Workspace & Skills Reference
</commit_message>
<xml_diff>
--- a/dist/files/ai-acceptable-use-policy.docx
+++ b/dist/files/ai-acceptable-use-policy.docx
@@ -3887,621 +3887,6 @@
     <w:p>
       <w:r>
         <w:br w:type="page"/>
-      </w:r>
-    </w:p>
-    <w:p>
-      <w:pPr>
-        <w:pBdr>
-          <w:bottom w:val="single" w:color="5CA832" w:sz="6" w:space="4"/>
-        </w:pBdr>
-        <w:spacing w:after="240" w:before="0"/>
-        <w:jc w:val="center"/>
-      </w:pPr>
-      <w:r>
-        <w:rPr>
-          <w:rFonts w:ascii="Arial" w:cs="Arial" w:eastAsia="Arial" w:hAnsi="Arial"/>
-          <w:b/>
-          <w:bCs/>
-          <w:color w:val="004B8D"/>
-          <w:sz w:val="28"/>
-          <w:szCs w:val="28"/>
-        </w:rPr>
-        <w:t xml:space="preserve">AI Acceptable Use Policy - Staff Acknowledgment</w:t>
-      </w:r>
-    </w:p>
-    <w:p>
-      <w:pPr>
-        <w:spacing w:after="0" w:before="160"/>
-      </w:pPr>
-      <w:r>
-        <w:t xml:space="preserve"/>
-      </w:r>
-    </w:p>
-    <w:p>
-      <w:pPr>
-        <w:spacing w:after="80" w:before="80"/>
-      </w:pPr>
-      <w:r>
-        <w:rPr>
-          <w:rFonts w:ascii="Arial" w:cs="Arial" w:eastAsia="Arial" w:hAnsi="Arial"/>
-          <w:color w:val="1F2D3D"/>
-          <w:sz w:val="22"/>
-          <w:szCs w:val="22"/>
-        </w:rPr>
-        <w:t xml:space="preserve">By signing below, I acknowledge that I have received, read, and understood the School Technology AI Acceptable Use Policy (Version 1.0). I agree to comply with the requirements of this policy and understand that violations may result in disciplinary action.</w:t>
-      </w:r>
-    </w:p>
-    <w:p>
-      <w:pPr>
-        <w:spacing w:after="0" w:before="80"/>
-      </w:pPr>
-      <w:r>
-        <w:t xml:space="preserve"/>
-      </w:r>
-    </w:p>
-    <w:p>
-      <w:pPr>
-        <w:spacing w:after="80" w:before="80"/>
-      </w:pPr>
-      <w:r>
-        <w:rPr>
-          <w:rFonts w:ascii="Arial" w:cs="Arial" w:eastAsia="Arial" w:hAnsi="Arial"/>
-          <w:color w:val="1F2D3D"/>
-          <w:sz w:val="22"/>
-          <w:szCs w:val="22"/>
-        </w:rPr>
-        <w:t xml:space="preserve">I understand that:</w:t>
-      </w:r>
-    </w:p>
-    <w:p>
-      <w:pPr>
-        <w:pStyle w:val="ListParagraph"/>
-        <w:numPr>
-          <w:ilvl w:val="0"/>
-          <w:numId w:val="2"/>
-        </w:numPr>
-        <w:spacing w:after="60" w:before="60"/>
-      </w:pPr>
-      <w:r>
-        <w:rPr>
-          <w:rFonts w:ascii="Arial" w:cs="Arial" w:eastAsia="Arial" w:hAnsi="Arial"/>
-          <w:color w:val="1F2D3D"/>
-          <w:sz w:val="22"/>
-          <w:szCs w:val="22"/>
-        </w:rPr>
-        <w:t xml:space="preserve">I may only use AI tools that have been approved by IT for School Technology work</w:t>
-      </w:r>
-    </w:p>
-    <w:p>
-      <w:pPr>
-        <w:pStyle w:val="ListParagraph"/>
-        <w:numPr>
-          <w:ilvl w:val="0"/>
-          <w:numId w:val="2"/>
-        </w:numPr>
-        <w:spacing w:after="60" w:before="60"/>
-      </w:pPr>
-      <w:r>
-        <w:rPr>
-          <w:rFonts w:ascii="Arial" w:cs="Arial" w:eastAsia="Arial" w:hAnsi="Arial"/>
-          <w:color w:val="1F2D3D"/>
-          <w:sz w:val="22"/>
-          <w:szCs w:val="22"/>
-        </w:rPr>
-        <w:t xml:space="preserve">I must not enter restricted data (as defined in the AI Restricted Data Reference Guide) into any AI tool</w:t>
-      </w:r>
-    </w:p>
-    <w:p>
-      <w:pPr>
-        <w:pStyle w:val="ListParagraph"/>
-        <w:numPr>
-          <w:ilvl w:val="0"/>
-          <w:numId w:val="2"/>
-        </w:numPr>
-        <w:spacing w:after="60" w:before="60"/>
-      </w:pPr>
-      <w:r>
-        <w:rPr>
-          <w:rFonts w:ascii="Arial" w:cs="Arial" w:eastAsia="Arial" w:hAnsi="Arial"/>
-          <w:color w:val="1F2D3D"/>
-          <w:sz w:val="22"/>
-          <w:szCs w:val="22"/>
-        </w:rPr>
-        <w:t xml:space="preserve">I am responsible for reporting any suspected data disclosure incident to IT immediately</w:t>
-      </w:r>
-    </w:p>
-    <w:p>
-      <w:pPr>
-        <w:pStyle w:val="ListParagraph"/>
-        <w:numPr>
-          <w:ilvl w:val="0"/>
-          <w:numId w:val="2"/>
-        </w:numPr>
-        <w:spacing w:after="60" w:before="60"/>
-      </w:pPr>
-      <w:r>
-        <w:rPr>
-          <w:rFonts w:ascii="Arial" w:cs="Arial" w:eastAsia="Arial" w:hAnsi="Arial"/>
-          <w:color w:val="1F2D3D"/>
-          <w:sz w:val="22"/>
-          <w:szCs w:val="22"/>
-        </w:rPr>
-        <w:t xml:space="preserve">My individual conversation content in Claude Teams is private and is not visible to administrators</w:t>
-      </w:r>
-    </w:p>
-    <w:p>
-      <w:pPr>
-        <w:pStyle w:val="ListParagraph"/>
-        <w:numPr>
-          <w:ilvl w:val="0"/>
-          <w:numId w:val="2"/>
-        </w:numPr>
-        <w:spacing w:after="60" w:before="60"/>
-      </w:pPr>
-      <w:r>
-        <w:rPr>
-          <w:rFonts w:ascii="Arial" w:cs="Arial" w:eastAsia="Arial" w:hAnsi="Arial"/>
-          <w:color w:val="1F2D3D"/>
-          <w:sz w:val="22"/>
-          <w:szCs w:val="22"/>
-        </w:rPr>
-        <w:t xml:space="preserve">This policy will be updated as the AI rollout progresses and I will be notified of material changes</w:t>
-      </w:r>
-    </w:p>
-    <w:p>
-      <w:pPr>
-        <w:spacing w:after="0" w:before="240"/>
-      </w:pPr>
-      <w:r>
-        <w:t xml:space="preserve"/>
-      </w:r>
-    </w:p>
-    <w:tbl>
-      <w:tblPr>
-        <w:tblW w:type="dxa" w:w="9360"/>
-        <w:tblBorders>
-          <w:top w:val="single" w:color="auto" w:sz="4"/>
-          <w:left w:val="single" w:color="auto" w:sz="4"/>
-          <w:bottom w:val="single" w:color="auto" w:sz="4"/>
-          <w:right w:val="single" w:color="auto" w:sz="4"/>
-          <w:insideH w:val="single" w:color="auto" w:sz="4"/>
-          <w:insideV w:val="single" w:color="auto" w:sz="4"/>
-        </w:tblBorders>
-      </w:tblPr>
-      <w:tblGrid>
-        <w:gridCol w:w="4440"/>
-        <w:gridCol w:w="720"/>
-        <w:gridCol w:w="4200"/>
-      </w:tblGrid>
-      <w:tr>
-        <w:tc>
-          <w:tcPr>
-            <w:tcW w:type="dxa" w:w="4440"/>
-            <w:tcBorders>
-              <w:top w:val="none" w:color="FFFFFF" w:sz="0"/>
-              <w:left w:val="none" w:color="FFFFFF" w:sz="0"/>
-              <w:bottom w:val="single" w:color="CCCCCC" w:sz="1"/>
-              <w:right w:val="none" w:color="FFFFFF" w:sz="0"/>
-            </w:tcBorders>
-            <w:tcMar>
-              <w:top w:type="dxa" w:w="80"/>
-              <w:left w:type="dxa" w:w="0"/>
-              <w:bottom w:type="dxa" w:w="80"/>
-              <w:right w:type="dxa" w:w="0"/>
-            </w:tcMar>
-          </w:tcPr>
-          <w:p>
-            <w:pPr>
-              <w:spacing w:after="0" w:before="0"/>
-            </w:pPr>
-            <w:r>
-              <w:rPr>
-                <w:rFonts w:ascii="Arial" w:cs="Arial" w:eastAsia="Arial" w:hAnsi="Arial"/>
-                <w:sz w:val="22"/>
-                <w:szCs w:val="22"/>
-              </w:rPr>
-              <w:t xml:space="preserve"/>
-            </w:r>
-          </w:p>
-        </w:tc>
-        <w:tc>
-          <w:tcPr>
-            <w:tcW w:type="dxa" w:w="720"/>
-            <w:tcBorders>
-              <w:top w:val="none" w:color="FFFFFF" w:sz="0"/>
-              <w:left w:val="none" w:color="FFFFFF" w:sz="0"/>
-              <w:bottom w:val="none" w:color="FFFFFF" w:sz="0"/>
-              <w:right w:val="none" w:color="FFFFFF" w:sz="0"/>
-            </w:tcBorders>
-            <w:tcMar>
-              <w:top w:type="dxa" w:w="80"/>
-              <w:left w:type="dxa" w:w="0"/>
-              <w:bottom w:type="dxa" w:w="80"/>
-              <w:right w:type="dxa" w:w="0"/>
-            </w:tcMar>
-          </w:tcPr>
-          <w:p>
-            <w:pPr>
-              <w:spacing w:after="0" w:before="0"/>
-            </w:pPr>
-            <w:r>
-              <w:rPr>
-                <w:rFonts w:ascii="Arial" w:cs="Arial" w:eastAsia="Arial" w:hAnsi="Arial"/>
-                <w:sz w:val="22"/>
-                <w:szCs w:val="22"/>
-              </w:rPr>
-              <w:t xml:space="preserve"/>
-            </w:r>
-          </w:p>
-        </w:tc>
-        <w:tc>
-          <w:tcPr>
-            <w:tcW w:type="dxa" w:w="4200"/>
-            <w:tcBorders>
-              <w:top w:val="none" w:color="FFFFFF" w:sz="0"/>
-              <w:left w:val="none" w:color="FFFFFF" w:sz="0"/>
-              <w:bottom w:val="single" w:color="CCCCCC" w:sz="1"/>
-              <w:right w:val="none" w:color="FFFFFF" w:sz="0"/>
-            </w:tcBorders>
-            <w:tcMar>
-              <w:top w:type="dxa" w:w="80"/>
-              <w:left w:type="dxa" w:w="0"/>
-              <w:bottom w:type="dxa" w:w="80"/>
-              <w:right w:type="dxa" w:w="0"/>
-            </w:tcMar>
-          </w:tcPr>
-          <w:p>
-            <w:pPr>
-              <w:spacing w:after="0" w:before="0"/>
-            </w:pPr>
-            <w:r>
-              <w:rPr>
-                <w:rFonts w:ascii="Arial" w:cs="Arial" w:eastAsia="Arial" w:hAnsi="Arial"/>
-                <w:sz w:val="22"/>
-                <w:szCs w:val="22"/>
-              </w:rPr>
-              <w:t xml:space="preserve"/>
-            </w:r>
-          </w:p>
-        </w:tc>
-      </w:tr>
-      <w:tr>
-        <w:tc>
-          <w:tcPr>
-            <w:tcW w:type="dxa" w:w="4440"/>
-            <w:tcBorders>
-              <w:top w:val="none" w:color="FFFFFF" w:sz="0"/>
-              <w:left w:val="none" w:color="FFFFFF" w:sz="0"/>
-              <w:bottom w:val="none" w:color="FFFFFF" w:sz="0"/>
-              <w:right w:val="none" w:color="FFFFFF" w:sz="0"/>
-            </w:tcBorders>
-            <w:tcMar>
-              <w:top w:type="dxa" w:w="40"/>
-              <w:left w:type="dxa" w:w="0"/>
-              <w:bottom w:type="dxa" w:w="80"/>
-              <w:right w:type="dxa" w:w="0"/>
-            </w:tcMar>
-          </w:tcPr>
-          <w:p>
-            <w:pPr>
-              <w:spacing w:after="0" w:before="0"/>
-            </w:pPr>
-            <w:r>
-              <w:rPr>
-                <w:rFonts w:ascii="Arial" w:cs="Arial" w:eastAsia="Arial" w:hAnsi="Arial"/>
-                <w:i/>
-                <w:iCs/>
-                <w:color w:val="888888"/>
-                <w:sz w:val="20"/>
-                <w:szCs w:val="20"/>
-              </w:rPr>
-              <w:t xml:space="preserve">Employee Name (Print)</w:t>
-            </w:r>
-          </w:p>
-        </w:tc>
-        <w:tc>
-          <w:tcPr>
-            <w:tcW w:type="dxa" w:w="720"/>
-            <w:tcBorders>
-              <w:top w:val="none" w:color="FFFFFF" w:sz="0"/>
-              <w:left w:val="none" w:color="FFFFFF" w:sz="0"/>
-              <w:bottom w:val="none" w:color="FFFFFF" w:sz="0"/>
-              <w:right w:val="none" w:color="FFFFFF" w:sz="0"/>
-            </w:tcBorders>
-            <w:tcMar>
-              <w:top w:type="dxa" w:w="40"/>
-              <w:left w:type="dxa" w:w="0"/>
-              <w:bottom w:type="dxa" w:w="80"/>
-              <w:right w:type="dxa" w:w="0"/>
-            </w:tcMar>
-          </w:tcPr>
-          <w:p>
-            <w:pPr>
-              <w:spacing w:after="0" w:before="0"/>
-            </w:pPr>
-            <w:r>
-              <w:rPr>
-                <w:rFonts w:ascii="Arial" w:cs="Arial" w:eastAsia="Arial" w:hAnsi="Arial"/>
-                <w:sz w:val="20"/>
-                <w:szCs w:val="20"/>
-              </w:rPr>
-              <w:t xml:space="preserve"/>
-            </w:r>
-          </w:p>
-        </w:tc>
-        <w:tc>
-          <w:tcPr>
-            <w:tcW w:type="dxa" w:w="4200"/>
-            <w:tcBorders>
-              <w:top w:val="none" w:color="FFFFFF" w:sz="0"/>
-              <w:left w:val="none" w:color="FFFFFF" w:sz="0"/>
-              <w:bottom w:val="none" w:color="FFFFFF" w:sz="0"/>
-              <w:right w:val="none" w:color="FFFFFF" w:sz="0"/>
-            </w:tcBorders>
-            <w:tcMar>
-              <w:top w:type="dxa" w:w="40"/>
-              <w:left w:type="dxa" w:w="0"/>
-              <w:bottom w:type="dxa" w:w="80"/>
-              <w:right w:type="dxa" w:w="0"/>
-            </w:tcMar>
-          </w:tcPr>
-          <w:p>
-            <w:pPr>
-              <w:spacing w:after="0" w:before="0"/>
-            </w:pPr>
-            <w:r>
-              <w:rPr>
-                <w:rFonts w:ascii="Arial" w:cs="Arial" w:eastAsia="Arial" w:hAnsi="Arial"/>
-                <w:i/>
-                <w:iCs/>
-                <w:color w:val="888888"/>
-                <w:sz w:val="20"/>
-                <w:szCs w:val="20"/>
-              </w:rPr>
-              <w:t xml:space="preserve">Date</w:t>
-            </w:r>
-          </w:p>
-        </w:tc>
-      </w:tr>
-    </w:tbl>
-    <w:p>
-      <w:pPr>
-        <w:spacing w:after="0" w:before="240"/>
-      </w:pPr>
-      <w:r>
-        <w:t xml:space="preserve"/>
-      </w:r>
-    </w:p>
-    <w:tbl>
-      <w:tblPr>
-        <w:tblW w:type="dxa" w:w="9360"/>
-        <w:tblBorders>
-          <w:top w:val="single" w:color="auto" w:sz="4"/>
-          <w:left w:val="single" w:color="auto" w:sz="4"/>
-          <w:bottom w:val="single" w:color="auto" w:sz="4"/>
-          <w:right w:val="single" w:color="auto" w:sz="4"/>
-          <w:insideH w:val="single" w:color="auto" w:sz="4"/>
-          <w:insideV w:val="single" w:color="auto" w:sz="4"/>
-        </w:tblBorders>
-      </w:tblPr>
-      <w:tblGrid>
-        <w:gridCol w:w="4440"/>
-        <w:gridCol w:w="720"/>
-        <w:gridCol w:w="4200"/>
-      </w:tblGrid>
-      <w:tr>
-        <w:tc>
-          <w:tcPr>
-            <w:tcW w:type="dxa" w:w="4440"/>
-            <w:tcBorders>
-              <w:top w:val="none" w:color="FFFFFF" w:sz="0"/>
-              <w:left w:val="none" w:color="FFFFFF" w:sz="0"/>
-              <w:bottom w:val="single" w:color="CCCCCC" w:sz="1"/>
-              <w:right w:val="none" w:color="FFFFFF" w:sz="0"/>
-            </w:tcBorders>
-            <w:tcMar>
-              <w:top w:type="dxa" w:w="80"/>
-              <w:left w:type="dxa" w:w="0"/>
-              <w:bottom w:type="dxa" w:w="80"/>
-              <w:right w:type="dxa" w:w="0"/>
-            </w:tcMar>
-          </w:tcPr>
-          <w:p>
-            <w:pPr>
-              <w:spacing w:after="0" w:before="0"/>
-            </w:pPr>
-            <w:r>
-              <w:rPr>
-                <w:rFonts w:ascii="Arial" w:cs="Arial" w:eastAsia="Arial" w:hAnsi="Arial"/>
-                <w:sz w:val="22"/>
-                <w:szCs w:val="22"/>
-              </w:rPr>
-              <w:t xml:space="preserve"/>
-            </w:r>
-          </w:p>
-        </w:tc>
-        <w:tc>
-          <w:tcPr>
-            <w:tcW w:type="dxa" w:w="720"/>
-            <w:tcBorders>
-              <w:top w:val="none" w:color="FFFFFF" w:sz="0"/>
-              <w:left w:val="none" w:color="FFFFFF" w:sz="0"/>
-              <w:bottom w:val="none" w:color="FFFFFF" w:sz="0"/>
-              <w:right w:val="none" w:color="FFFFFF" w:sz="0"/>
-            </w:tcBorders>
-            <w:tcMar>
-              <w:top w:type="dxa" w:w="80"/>
-              <w:left w:type="dxa" w:w="0"/>
-              <w:bottom w:type="dxa" w:w="80"/>
-              <w:right w:type="dxa" w:w="0"/>
-            </w:tcMar>
-          </w:tcPr>
-          <w:p>
-            <w:pPr>
-              <w:spacing w:after="0" w:before="0"/>
-            </w:pPr>
-            <w:r>
-              <w:rPr>
-                <w:rFonts w:ascii="Arial" w:cs="Arial" w:eastAsia="Arial" w:hAnsi="Arial"/>
-                <w:sz w:val="22"/>
-                <w:szCs w:val="22"/>
-              </w:rPr>
-              <w:t xml:space="preserve"/>
-            </w:r>
-          </w:p>
-        </w:tc>
-        <w:tc>
-          <w:tcPr>
-            <w:tcW w:type="dxa" w:w="4200"/>
-            <w:tcBorders>
-              <w:top w:val="none" w:color="FFFFFF" w:sz="0"/>
-              <w:left w:val="none" w:color="FFFFFF" w:sz="0"/>
-              <w:bottom w:val="single" w:color="CCCCCC" w:sz="1"/>
-              <w:right w:val="none" w:color="FFFFFF" w:sz="0"/>
-            </w:tcBorders>
-            <w:tcMar>
-              <w:top w:type="dxa" w:w="80"/>
-              <w:left w:type="dxa" w:w="0"/>
-              <w:bottom w:type="dxa" w:w="80"/>
-              <w:right w:type="dxa" w:w="0"/>
-            </w:tcMar>
-          </w:tcPr>
-          <w:p>
-            <w:pPr>
-              <w:spacing w:after="0" w:before="0"/>
-            </w:pPr>
-            <w:r>
-              <w:rPr>
-                <w:rFonts w:ascii="Arial" w:cs="Arial" w:eastAsia="Arial" w:hAnsi="Arial"/>
-                <w:sz w:val="22"/>
-                <w:szCs w:val="22"/>
-              </w:rPr>
-              <w:t xml:space="preserve"/>
-            </w:r>
-          </w:p>
-        </w:tc>
-      </w:tr>
-      <w:tr>
-        <w:tc>
-          <w:tcPr>
-            <w:tcW w:type="dxa" w:w="4440"/>
-            <w:tcBorders>
-              <w:top w:val="none" w:color="FFFFFF" w:sz="0"/>
-              <w:left w:val="none" w:color="FFFFFF" w:sz="0"/>
-              <w:bottom w:val="none" w:color="FFFFFF" w:sz="0"/>
-              <w:right w:val="none" w:color="FFFFFF" w:sz="0"/>
-            </w:tcBorders>
-            <w:tcMar>
-              <w:top w:type="dxa" w:w="40"/>
-              <w:left w:type="dxa" w:w="0"/>
-              <w:bottom w:type="dxa" w:w="80"/>
-              <w:right w:type="dxa" w:w="0"/>
-            </w:tcMar>
-          </w:tcPr>
-          <w:p>
-            <w:pPr>
-              <w:spacing w:after="0" w:before="0"/>
-            </w:pPr>
-            <w:r>
-              <w:rPr>
-                <w:rFonts w:ascii="Arial" w:cs="Arial" w:eastAsia="Arial" w:hAnsi="Arial"/>
-                <w:i/>
-                <w:iCs/>
-                <w:color w:val="888888"/>
-                <w:sz w:val="20"/>
-                <w:szCs w:val="20"/>
-              </w:rPr>
-              <w:t xml:space="preserve">Employee Signature</w:t>
-            </w:r>
-          </w:p>
-        </w:tc>
-        <w:tc>
-          <w:tcPr>
-            <w:tcW w:type="dxa" w:w="720"/>
-            <w:tcBorders>
-              <w:top w:val="none" w:color="FFFFFF" w:sz="0"/>
-              <w:left w:val="none" w:color="FFFFFF" w:sz="0"/>
-              <w:bottom w:val="none" w:color="FFFFFF" w:sz="0"/>
-              <w:right w:val="none" w:color="FFFFFF" w:sz="0"/>
-            </w:tcBorders>
-            <w:tcMar>
-              <w:top w:type="dxa" w:w="40"/>
-              <w:left w:type="dxa" w:w="0"/>
-              <w:bottom w:type="dxa" w:w="80"/>
-              <w:right w:type="dxa" w:w="0"/>
-            </w:tcMar>
-          </w:tcPr>
-          <w:p>
-            <w:pPr>
-              <w:spacing w:after="0" w:before="0"/>
-            </w:pPr>
-            <w:r>
-              <w:rPr>
-                <w:rFonts w:ascii="Arial" w:cs="Arial" w:eastAsia="Arial" w:hAnsi="Arial"/>
-                <w:sz w:val="20"/>
-                <w:szCs w:val="20"/>
-              </w:rPr>
-              <w:t xml:space="preserve"/>
-            </w:r>
-          </w:p>
-        </w:tc>
-        <w:tc>
-          <w:tcPr>
-            <w:tcW w:type="dxa" w:w="4200"/>
-            <w:tcBorders>
-              <w:top w:val="none" w:color="FFFFFF" w:sz="0"/>
-              <w:left w:val="none" w:color="FFFFFF" w:sz="0"/>
-              <w:bottom w:val="none" w:color="FFFFFF" w:sz="0"/>
-              <w:right w:val="none" w:color="FFFFFF" w:sz="0"/>
-            </w:tcBorders>
-            <w:tcMar>
-              <w:top w:type="dxa" w:w="40"/>
-              <w:left w:type="dxa" w:w="0"/>
-              <w:bottom w:type="dxa" w:w="80"/>
-              <w:right w:type="dxa" w:w="0"/>
-            </w:tcMar>
-          </w:tcPr>
-          <w:p>
-            <w:pPr>
-              <w:spacing w:after="0" w:before="0"/>
-            </w:pPr>
-            <w:r>
-              <w:rPr>
-                <w:rFonts w:ascii="Arial" w:cs="Arial" w:eastAsia="Arial" w:hAnsi="Arial"/>
-                <w:i/>
-                <w:iCs/>
-                <w:color w:val="888888"/>
-                <w:sz w:val="20"/>
-                <w:szCs w:val="20"/>
-              </w:rPr>
-              <w:t xml:space="preserve">Department</w:t>
-            </w:r>
-          </w:p>
-        </w:tc>
-      </w:tr>
-    </w:tbl>
-    <w:p>
-      <w:pPr>
-        <w:spacing w:after="0" w:before="160"/>
-      </w:pPr>
-      <w:r>
-        <w:t xml:space="preserve"/>
-      </w:r>
-    </w:p>
-    <w:p>
-      <w:pPr>
-        <w:spacing w:after="80" w:before="80"/>
-      </w:pPr>
-      <w:r>
-        <w:rPr>
-          <w:rFonts w:ascii="Arial" w:cs="Arial" w:eastAsia="Arial" w:hAnsi="Arial"/>
-          <w:i/>
-          <w:iCs/>
-          <w:color w:val="888888"/>
-          <w:sz w:val="22"/>
-          <w:szCs w:val="22"/>
-        </w:rPr>
-        <w:t xml:space="preserve">Return completed form to IT.</w:t>
       </w:r>
     </w:p>
     <w:sectPr>

</xml_diff>